<commit_message>
Thesis Paper Update 2
</commit_message>
<xml_diff>
--- a/paper/diabetes_ML_manuscript.docx
+++ b/paper/diabetes_ML_manuscript.docx
@@ -3070,10 +3070,12 @@
     <w:p>
       <w:pPr>
         <w:pStyle w:val="Heading2"/>
-      </w:pPr>
-      <w:r>
-        <w:rPr>
-          <w:rFonts w:ascii="Times New Roman" w:hAnsi="Times New Roman"/>
+        <w:jc w:val="left"/>
+      </w:pPr>
+      <w:r>
+        <w:rPr>
+          <w:rFonts w:ascii="Times New Roman" w:hAnsi="Times New Roman"/>
+          <w:b/>
           <w:sz w:val="24"/>
         </w:rPr>
         <w:lastRenderedPageBreak/>

</xml_diff>